<commit_message>
revise ComNet paper and experiments for resubmission
</commit_message>
<xml_diff>
--- a/publications/comnet/submission/biography.docx
+++ b/publications/comnet/submission/biography.docx
@@ -7,27 +7,17 @@
         <w:rPr>
           <w:rStyle w:val="Strong"/>
         </w:rPr>
-        <w:t>Fabrício</w:t>
+        <w:t>Fabrício holds an M.Sc. and Ph.D. in Chemistry from the Federal University of Rio de Janeiro, with postdoctoral research at Unicamp, where he published on computational modeling of chemical systems. He later transitioned to software development, earning a computer science diploma from Langara College in Canada. He is the author of mqtt5, the open-source Rust MQTT library evaluated in this work, and of MQDB, a distributed reactive database built on MQTT 5.0, both developed under the LabOverWire organization. His research interests include distributed messaging systems, MQTT 5.0 protocol design and conformance, pub/sub performance benchmarking, and transport-layer optimization for IoT infrastructure.</w:t>
       </w:r>
-      <w:r>
-        <w:t xml:space="preserve"> holds an M.Sc. and Ph.D. in Chemistry from the Federal University of Rio de Janeiro, with postdoctoral research at </w:t>
-      </w:r>
+      <w:r/>
       <w:proofErr w:type="spellStart"/>
-      <w:r>
-        <w:t>Unicamp</w:t>
-      </w:r>
+      <w:r/>
       <w:proofErr w:type="spellEnd"/>
-      <w:r>
-        <w:t xml:space="preserve">, where he published on computational modeling of chemical systems. He later transitioned to software development, earning a computer science diploma from Langara College in Canada. He is the creator of MQDB, a QUIC-based pub/sub message broker developed under the </w:t>
-      </w:r>
+      <w:r/>
       <w:proofErr w:type="spellStart"/>
-      <w:r>
-        <w:t>LabOverWire</w:t>
-      </w:r>
+      <w:r/>
       <w:proofErr w:type="spellEnd"/>
-      <w:r>
-        <w:t xml:space="preserve"> organization, built entirely in Rust. His research interests include distributed messaging systems, MQTT 5.0 protocol design and conformance, pub/sub performance benchmarking, and transport-layer optimization for IoT infrastructure.</w:t>
-      </w:r>
+      <w:r/>
     </w:p>
     <w:sectPr>
       <w:pgSz w:w="12240" w:h="15840"/>

</xml_diff>

<commit_message>
revise ComNet paper and experiments for resubmission (#176)
</commit_message>
<xml_diff>
--- a/publications/comnet/submission/biography.docx
+++ b/publications/comnet/submission/biography.docx
@@ -7,27 +7,17 @@
         <w:rPr>
           <w:rStyle w:val="Strong"/>
         </w:rPr>
-        <w:t>Fabrício</w:t>
+        <w:t>Fabrício holds an M.Sc. and Ph.D. in Chemistry from the Federal University of Rio de Janeiro, with postdoctoral research at Unicamp, where he published on computational modeling of chemical systems. He later transitioned to software development, earning a computer science diploma from Langara College in Canada. He is the author of mqtt5, the open-source Rust MQTT library evaluated in this work, and of MQDB, a distributed reactive database built on MQTT 5.0, both developed under the LabOverWire organization. His research interests include distributed messaging systems, MQTT 5.0 protocol design and conformance, pub/sub performance benchmarking, and transport-layer optimization for IoT infrastructure.</w:t>
       </w:r>
-      <w:r>
-        <w:t xml:space="preserve"> holds an M.Sc. and Ph.D. in Chemistry from the Federal University of Rio de Janeiro, with postdoctoral research at </w:t>
-      </w:r>
+      <w:r/>
       <w:proofErr w:type="spellStart"/>
-      <w:r>
-        <w:t>Unicamp</w:t>
-      </w:r>
+      <w:r/>
       <w:proofErr w:type="spellEnd"/>
-      <w:r>
-        <w:t xml:space="preserve">, where he published on computational modeling of chemical systems. He later transitioned to software development, earning a computer science diploma from Langara College in Canada. He is the creator of MQDB, a QUIC-based pub/sub message broker developed under the </w:t>
-      </w:r>
+      <w:r/>
       <w:proofErr w:type="spellStart"/>
-      <w:r>
-        <w:t>LabOverWire</w:t>
-      </w:r>
+      <w:r/>
       <w:proofErr w:type="spellEnd"/>
-      <w:r>
-        <w:t xml:space="preserve"> organization, built entirely in Rust. His research interests include distributed messaging systems, MQTT 5.0 protocol design and conformance, pub/sub performance benchmarking, and transport-layer optimization for IoT infrastructure.</w:t>
-      </w:r>
+      <w:r/>
     </w:p>
     <w:sectPr>
       <w:pgSz w:w="12240" w:h="15840"/>

</xml_diff>